<commit_message>
upating for ms submission
</commit_message>
<xml_diff>
--- a/TablesFigures/mod_age_1996_2025_output.docx
+++ b/TablesFigures/mod_age_1996_2025_output.docx
@@ -634,7 +634,7 @@
                 <w:szCs w:val="22"/>
                 <w:color w:val="000000"/>
               </w:rPr>
-              <w:t xml:space="preserve">Maternal age : Pre-threshold (&lt; 9 years)</w:t>
+              <w:t xml:space="preserve">Maternal age : Pre-threshold (&lt; 8 years)</w:t>
             </w:r>
           </w:p>
         </w:tc>
@@ -925,7 +925,7 @@
                 <w:szCs w:val="22"/>
                 <w:color w:val="000000"/>
               </w:rPr>
-              <w:t xml:space="preserve">Maternal age : Post-threshold (≥ 9 years)</w:t>
+              <w:t xml:space="preserve">Maternal age : Post-threshold (≥ 8 years)</w:t>
             </w:r>
           </w:p>
         </w:tc>

</xml_diff>